<commit_message>
Complete reviewer response and reproducibility updates
</commit_message>
<xml_diff>
--- a/outputs/response_to_reviewers.docx
+++ b/outputs/response_to_reviewers.docx
@@ -122,7 +122,7 @@
           <w:rFonts w:ascii="Times New Roman" w:hAnsi="Times New Roman"/>
           <w:sz w:val="21"/>
         </w:rPr>
-        <w:t>We include the regenerated ten-seed table with the seed, each model's accuracy and count, and the ratio calculated for each seed. No seed was excluded in the completed run.</w:t>
+        <w:t>We include the regenerated ten-seed table with each seed, accuracy, and the two solver-specific counts. The table defines the classical count as the sum of RBF SVC support vectors and the quantum count as distinct Pegasos active training examples. We omit a ratio because these counts are defined by different optimization procedures.</w:t>
       </w:r>
     </w:p>
     <w:p>
@@ -142,7 +142,7 @@
           <w:rFonts w:ascii="Times New Roman" w:hAnsi="Times New Roman"/>
           <w:sz w:val="21"/>
         </w:rPr>
-        <w:t>We distinguish the single-run count ratio from the ten-seed mean. The regenerated mean of per-seed ratios is 15.61, with a percentile-bootstrap 95% interval of 13.61–17.91 (n=10); this replaces the previous 25.34 claim. The manuscript also states that Pegasos active-set counts and SVC support-vector counts arise from different solvers and do not by themselves establish equivalent inference cost.</w:t>
+        <w:t>We withdrew both the earlier single-run ratio of 25.34 and the ten-seed mean ratio of 15.61. They divide counts produced by different solvers and therefore do not estimate a common compression or efficiency quantity. The revised table retains the raw per-seed counts with explicit solver-specific definitions; it reports no count ratio, inferential test on those counts, or computational-efficiency claim.</w:t>
       </w:r>
     </w:p>
     <w:p>
@@ -194,7 +194,7 @@
           <w:rFonts w:ascii="Times New Roman" w:hAnsi="Times New Roman"/>
           <w:sz w:val="21"/>
         </w:rPr>
-        <w:t>We regenerated one authoritative correlation table from the 24 distinct settings after excluding the repeated model setting described above. For log10(condition number), Pearson r is -0.516 and Spearman rho is -0.519 (n=24). Under the recorded absolute z-score &gt; 2 rule, n=22, Pearson r is -0.667 and Spearman rho is -0.606. The table records the transformation, outlier rule, p-values, and Pearson confidence intervals. Because all settings use the same train/test split, the configuration points are dependent; we interpret these small-sample statistics descriptively, not as independent-sample evidence.</w:t>
+        <w:t>We traced the earlier draft values to its 25-row sweep table. Recomputing log10(condition number) against accuracy on all 25 rows reproduces Pearson r = -0.521 and Spearman rho = -0.517 (n=25); applying the draft's absolute z-score &gt; 2 rule reproduces r = -0.672 and rho = -0.600 (n=23). The 25 rows include the same Pauli-XYZ, PCA=2, 2-qubit, 2-repetition, 200-iteration setting twice, once from each sweep. Removing that duplicate changes the all-setting result to r = -0.516 and rho = -0.519 (n=24), and the z-score-excluded result to r = -0.667 and rho = -0.606 (n=22). Thus the discrepancy came from counting one repeated configuration and recomputing the outlier rule on the changed sample; the earlier figures are reproducible but are superseded by the deduplicated analysis. The machine-readable reconciliation records both calculations. All settings share one train/test split, so we treat these small-sample associations as descriptive rather than independent-sample evidence.</w:t>
       </w:r>
     </w:p>
     <w:p>
@@ -214,7 +214,7 @@
           <w:rFonts w:ascii="Times New Roman" w:hAnsi="Times New Roman"/>
           <w:sz w:val="21"/>
         </w:rPr>
-        <w:t>We report solver-specific counts and the exact Pegasos and classical settings in the run manifest. The ten-seed comparison uses matched PCA(2) representations and split seeds. We no longer characterize the ratio as a computational advantage. Longer-iteration sensitivity runs are not claimed as completed.</w:t>
+        <w:t>We now state exactly what each count measures. For the classical RBF SVC (gamma='scale', C=1), the count is the sum of scikit-learn's per-class support-vector counts. For quantum Pauli-XYZ Pegasos, it is the number of distinct training examples that entered the active set after a margin-violating update; the ten-seed run uses lambda=0.02 and 100 sampled updates. Both pipelines use seed-matched splits and two PCA components, but the classical features are standardized while the quantum inputs are MinMax-scaled to [0, pi]. Thus the models are matched by split and PCA dimension, while their input scaling and solvers differ. The manuscript reports the raw counts descriptively, removes the count ratio and count significance test, and makes no memory, inference-time, or compression claim. The run manifest records these settings. Longer-iteration sensitivity runs are not claimed as completed.</w:t>
       </w:r>
     </w:p>
     <w:p>
@@ -234,7 +234,7 @@
           <w:rFonts w:ascii="Times New Roman" w:hAnsi="Times New Roman"/>
           <w:sz w:val="21"/>
         </w:rPr>
-        <w:t>We state the tested qubit range and restrict conclusions to the evaluated configurations. The geometry subset has n=400. A higher-qubit geometry sweep is not claimed as completed.</w:t>
+        <w:t>The full geometry sweep tested 2, 3, and 4 qubits, but its coverage is unbalanced. The four feature-map comparisons and 12 depth-sweep settings held qubit count at 2 to isolate those factors at fixed width. The narrower Pauli-XYZ PCA/qubit tradeoff tested 3 settings each at 2, 3, and 4 qubits across PCA dimensions 2, 3, and 4. After deduplication, the 24 settings comprise 18 at 2 qubits, 3 at 3 qubits, and 3 at 4 qubits; geometry diagnostics use n=400. We now state that this is not a balanced qubit-scaling study and limit conclusions to these settings. We make no claim about qubit counts above 4.</w:t>
       </w:r>
     </w:p>
     <w:p>
@@ -254,7 +254,7 @@
           <w:rFonts w:ascii="Times New Roman" w:hAnsi="Times New Roman"/>
           <w:sz w:val="21"/>
         </w:rPr>
-        <w:t>We retain the breast-cancer table only as a classification sanity check and state that the geometry protocol was not replicated there. We excluded WELFake and LIAR from confirmatory claims and manuscript tables because the saved outputs contain conflicting runs and incomplete provenance; a matched reproducible evaluation remains future work.</w:t>
+        <w:t>We revised the manuscript to state that cross-dataset generalization has not been established. The breast-cancer experiment is a separate classification sanity check; it does not reproduce the fake-news task, preprocessing, or geometry protocol and is not used to validate the geometry findings. WELFake and LIAR results are excluded from manuscript tables and claims because their saved outputs contain conflicting runs and incomplete provenance. We removed the earlier wording that implied the breast-cancer check ruled out a dataset-specific result. A matched, provenance-complete geometry evaluation across multiple fake-news datasets remains future work.</w:t>
       </w:r>
     </w:p>
     <w:p>
@@ -334,7 +334,7 @@
           <w:rFonts w:ascii="Times New Roman" w:hAnsi="Times New Roman"/>
           <w:sz w:val="21"/>
         </w:rPr>
-        <w:t>The revised methods describe the split, seed, preprocessing, feature maps, matrix centering, ridge, eigengap and condition-number definitions, geometry subset, and noise protocol. A machine-readable run manifest records qubits, repetitions, Pegasos settings, shots, noise values, and software versions.</w:t>
+        <w:t>We expanded the methods with the retained-row and label rules; categorical encoding; stratified split and seed; train-fitted PCA and scaler order; padding/truncation for mismatched PCA and qubit dimensions; exact Qiskit feature-map families, entanglement choices, and ideal fidelity-kernel calculation; Pegasos update rule, lambda, and iteration counts; classical model hyperparameters and metric conventions; and the Aer noise channel, gate sets, error probabilities, shots, subsets, and transpiler optimization level. The run manifest now records these settings together with software versions. We also disclose that the PCA(2) five-fold check reuses PCA fitted on the outer training split, so it is not a fully fold-isolated preprocessing estimate.</w:t>
       </w:r>
     </w:p>
     <w:p>
@@ -354,7 +354,7 @@
           <w:rFonts w:ascii="Times New Roman" w:hAnsi="Times New Roman"/>
           <w:sz w:val="21"/>
         </w:rPr>
-        <w:t>We position the contribution as a joint empirical evaluation of established geometry diagnostics in this fake-news metadata setting, not as a new metric or a demonstrated quantum advantage. We added recent work on quantum-kernel concentration and generalization.</w:t>
+        <w:t>We revised the related work to acknowledge prior fake-news QML directly, including Tian (2023), which evaluates QKNN/QSVM/VQC, and Khalil et al. (2025), which studies PegasosQSVM with PCA and Z/ZZ feature maps on BuzzFace and TruthSeeker. We therefore withdraw any implication that this paper is the first quantum fake-news classifier or proposes a new classifier, feature map, or Pegasos algorithm. We distinguish the present contribution as a bounded empirical diagnostic study: we report alignment, spectral summaries, and conditioning with accuracy across 24 distinct settings for structured Facebook fact-check metadata, alongside a ten-seed matched PCA(2) RBF comparison and a modeled finite-shot stress test. We added a comparison table and relevant references. We explicitly limit novelty to this task-specific empirical synthesis; we do not claim a new metric, causal mechanism, cross-dataset generalization, or quantum advantage.</w:t>
       </w:r>
     </w:p>
     <w:p>
@@ -386,7 +386,7 @@
           <w:rFonts w:ascii="Times New Roman" w:hAnsi="Times New Roman"/>
           <w:sz w:val="21"/>
         </w:rPr>
-        <w:t>We added verified feature-map, preprocessing, regularization, split, diagnostic, and noise details and refer to the run manifest for exact settings. No unrecorded circuit constants are asserted.</w:t>
+        <w:t>The experimental setup now states the data filters and label mapping, categorical encoding, train/test split, train-only PCA/scaling, feature-map circuit constructions and entanglement, exact fidelity kernel, Pegasos update and settings, baseline hyperparameters, geometry definitions, and simulator noise gate model. The run manifest provides the machine-readable configuration and package versions; the response does not infer undocumented circuit constants.</w:t>
       </w:r>
     </w:p>
     <w:p>
@@ -426,7 +426,7 @@
           <w:rFonts w:ascii="Times New Roman" w:hAnsi="Times New Roman"/>
           <w:sz w:val="21"/>
         </w:rPr>
-        <w:t>We added peer-reviewed 2024 work on concentration and generalization and 2026 work on benign overfitting with quantum kernels. The title remains focused on geometry analysis for fake-news detection; the abstract and conclusion now state that the results are exploratory and do not demonstrate quantum advantage.</w:t>
+        <w:t>We added prior quantum fake-news studies (Tian, 2023; Khalil et al., 2025) and explain how their classifier-performance focus differs from this paper's geometry-diagnostic focus. We also position our exploratory measurements alongside established quantum feature-space, kernel-concentration, and generalization work (Havlicek et al., 2019; Thanasilp et al., 2024; Gil-Fuster et al., 2024). The comparison table states both the overlap and the bounded distinction. The title remains descriptive of that contribution, and the abstract and conclusion do not claim quantum advantage.</w:t>
       </w:r>
     </w:p>
     <w:p>

</xml_diff>